<commit_message>
docs(seumei): update progress report with commerce slice
</commit_message>
<xml_diff>
--- a/docs/seumei/Seumei-Progress-and-Roadmap-2026-08-24.docx
+++ b/docs/seumei/Seumei-Progress-and-Roadmap-2026-08-24.docx
@@ -4215,10 +4215,7 @@
         <w:ind w:left="720" w:hanging="360"/>
       </w:pPr>
       <w:r>
-        <w:rPr>
-          <w:rFonts w:ascii="Calibri" w:hAnsi="Calibri"/>
-        </w:rPr>
-        <w:t>Products, Store, Orders, Dashboard e CRM ainda exibem entradas de capacidade, não slices operacionais completos.</w:t>
+        <w:t>Products e o primeiro fluxo Store/Orders já são slices funcionais. Dashboard e CRM ainda são as próximas capacidades operacionais a consumir os mesmos pedidos, produtos e clientes.</w:t>
       </w:r>
     </w:p>
     <w:p>
@@ -4254,10 +4251,7 @@
         <w:ind w:left="720" w:hanging="360"/>
       </w:pPr>
       <w:r>
-        <w:rPr>
-          <w:rFonts w:ascii="Calibri" w:hAnsi="Calibri"/>
-        </w:rPr>
-        <w:t>A fidelidade visual atingiu o Hub e o shell-base; as referências de Produtos, Store, Dashboard e CRM permanecem como metas dos próximos ciclos.</w:t>
+        <w:t>A fidelidade visual cobre Hub, shell-base, Produtos Admin, Loja Publicada e Detalhe do Produto em desktop/mobile. Dashboard, CRM e configuração operacional da loja permanecem como metas dos próximos ciclos.</w:t>
       </w:r>
     </w:p>
     <w:tbl>
@@ -4894,10 +4888,7 @@
     </w:p>
     <w:p>
       <w:r>
-        <w:rPr>
-          <w:rFonts w:ascii="Calibri" w:hAnsi="Calibri"/>
-        </w:rPr>
-        <w:t>A sequência recomendada mantém arquitetura antes de tela: definir Product, ProductCategory e ProductModifier; escrever testes de leitura e mutação cruzada; criar repositório vinculado ao TenantContext; implementar calculateOrderItemPrice; produzir view models; então reproduzir a referência administrativa de Produtos e ligar disponibilidade ao futuro catálogo publicado.</w:t>
+        <w:t>O slice recomendado anteriormente foi concluído: Catalog, Store e Orders agora formam um fluxo coerente, isolado por tenant e persistido pelo port de armazenamento. O próximo slice deve tornar Orders operacional e fazer Dashboard/CRM consumirem os pedidos já criados.</w:t>
       </w:r>
     </w:p>
     <w:p>
@@ -5384,6 +5375,552 @@
         <w:t>Este relatório é o checkpoint operacional: ele registra o que está publicado, quais garantias já existem, o que ainda não foi prometido como concluído e a ordem segura para continuar sem perder o contexto multiempresa.</w:t>
       </w:r>
     </w:p>
+    <w:p>
+      <w:r>
+        <w:br w:type="page"/>
+      </w:r>
+    </w:p>
+    <w:p>
+      <w:pPr>
+        <w:pStyle w:val="Heading1"/>
+      </w:pPr>
+      <w:r>
+        <w:t>14. Avanço publicado: Store e Commerce</w:t>
+      </w:r>
+    </w:p>
+    <w:p>
+      <w:r>
+        <w:t>O ciclo adicionou a primeira jornada pública de comércio sem criar uma segunda fonte de catálogo. A URL pública resolve o slug publicado, encontra a empresa proprietária, vincula o catálogo ao tenant e só então permite leitura, precificação, carrinho e criação de pedido.</w:t>
+      </w:r>
+    </w:p>
+    <w:p>
+      <w:pPr>
+        <w:pStyle w:val="ListBullet"/>
+      </w:pPr>
+      <w:r>
+        <w:t>Loja pública em /loja/[storeSlug], sem depender de companyId arbitrário recebido da interface.</w:t>
+      </w:r>
+    </w:p>
+    <w:p>
+      <w:pPr>
+        <w:pStyle w:val="ListBullet"/>
+      </w:pPr>
+      <w:r>
+        <w:t>Detalhe de produto com complementos, quantidade, observação e preço calculado na camada de aplicação/domínio.</w:t>
+      </w:r>
+    </w:p>
+    <w:p>
+      <w:pPr>
+        <w:pStyle w:val="ListBullet"/>
+      </w:pPr>
+      <w:r>
+        <w:t>Carrinho persistido por port de armazenamento e checkout que cria Order e OrderItem reais.</w:t>
+      </w:r>
+    </w:p>
+    <w:p>
+      <w:pPr>
+        <w:pStyle w:val="ListBullet"/>
+      </w:pPr>
+      <w:r>
+        <w:t>Galáxia Burger publicada e Matriz Labs em rascunho, comprovando resolução pública e separação entre tenants.</w:t>
+      </w:r>
+    </w:p>
+    <w:p>
+      <w:pPr>
+        <w:pStyle w:val="ListBullet"/>
+      </w:pPr>
+      <w:r>
+        <w:t>Catálogo administrativo e loja pública compartilham a mesma persistência: desativar um produto o remove da publicação.</w:t>
+      </w:r>
+    </w:p>
+    <w:p>
+      <w:pPr>
+        <w:pStyle w:val="ListBullet"/>
+      </w:pPr>
+      <w:r>
+        <w:t>Imagens específicas por produto e complemento, configuradas em fixtures, sem incorporar Galáxia Burger à arquitetura da plataforma.</w:t>
+      </w:r>
+    </w:p>
+    <w:p>
+      <w:pPr>
+        <w:pStyle w:val="Heading1"/>
+      </w:pPr>
+      <w:r>
+        <w:t>15. Garantias verificadas neste ciclo</w:t>
+      </w:r>
+    </w:p>
+    <w:tbl>
+      <w:tblPr>
+        <w:tblStyle w:val="TableGrid"/>
+        <w:tblW w:type="auto" w:w="0"/>
+        <w:tblLayout w:type="fixed"/>
+        <w:tblLook w:firstColumn="1" w:firstRow="1" w:lastColumn="0" w:lastRow="0" w:noHBand="0" w:noVBand="1" w:val="04A0"/>
+      </w:tblPr>
+      <w:tblGrid>
+        <w:gridCol w:w="2952"/>
+        <w:gridCol w:w="5976"/>
+      </w:tblGrid>
+      <w:tr>
+        <w:tc>
+          <w:tcPr>
+            <w:tcW w:type="dxa" w:w="4680"/>
+          </w:tcPr>
+          <w:p>
+            <w:r>
+              <w:t>Garantia</w:t>
+            </w:r>
+          </w:p>
+        </w:tc>
+        <w:tc>
+          <w:tcPr>
+            <w:tcW w:type="dxa" w:w="4680"/>
+          </w:tcPr>
+          <w:p>
+            <w:r>
+              <w:t>Evidência</w:t>
+            </w:r>
+          </w:p>
+        </w:tc>
+      </w:tr>
+      <w:tr>
+        <w:tc>
+          <w:tcPr>
+            <w:tcW w:type="dxa" w:w="2952"/>
+          </w:tcPr>
+          <w:p>
+            <w:r>
+              <w:t>Testes</w:t>
+            </w:r>
+          </w:p>
+        </w:tc>
+        <w:tc>
+          <w:tcPr>
+            <w:tcW w:type="dxa" w:w="5976"/>
+          </w:tcPr>
+          <w:p>
+            <w:r>
+              <w:t>55/55 testes do app Seumei aprovados em 20 arquivos.</w:t>
+            </w:r>
+          </w:p>
+        </w:tc>
+      </w:tr>
+      <w:tr>
+        <w:tc>
+          <w:tcPr>
+            <w:tcW w:type="dxa" w:w="2952"/>
+          </w:tcPr>
+          <w:p>
+            <w:r>
+              <w:t>Tenant isolation</w:t>
+            </w:r>
+          </w:p>
+        </w:tc>
+        <w:tc>
+          <w:tcPr>
+            <w:tcW w:type="dxa" w:w="5976"/>
+          </w:tcPr>
+          <w:p>
+            <w:r>
+              <w:t>Store, Catalog e Orders rejeitam leitura e mutação cruzadas; loja em rascunho não resolve publicamente.</w:t>
+            </w:r>
+          </w:p>
+        </w:tc>
+      </w:tr>
+      <w:tr>
+        <w:tc>
+          <w:tcPr>
+            <w:tcW w:type="dxa" w:w="2952"/>
+          </w:tcPr>
+          <w:p>
+            <w:r>
+              <w:t>Qualidade estática</w:t>
+            </w:r>
+          </w:p>
+        </w:tc>
+        <w:tc>
+          <w:tcPr>
+            <w:tcW w:type="dxa" w:w="5976"/>
+          </w:tcPr>
+          <w:p>
+            <w:r>
+              <w:t>Typecheck e lint sem erros.</w:t>
+            </w:r>
+          </w:p>
+        </w:tc>
+      </w:tr>
+      <w:tr>
+        <w:tc>
+          <w:tcPr>
+            <w:tcW w:type="dxa" w:w="2952"/>
+          </w:tcPr>
+          <w:p>
+            <w:r>
+              <w:t>Produção</w:t>
+            </w:r>
+          </w:p>
+        </w:tc>
+        <w:tc>
+          <w:tcPr>
+            <w:tcW w:type="dxa" w:w="5976"/>
+          </w:tcPr>
+          <w:p>
+            <w:r>
+              <w:t>Build Next.js aprovado com as rotas públicas dinâmicas.</w:t>
+            </w:r>
+          </w:p>
+        </w:tc>
+      </w:tr>
+      <w:tr>
+        <w:tc>
+          <w:tcPr>
+            <w:tcW w:type="dxa" w:w="2952"/>
+          </w:tcPr>
+          <w:p>
+            <w:r>
+              <w:t>Fluxo no navegador</w:t>
+            </w:r>
+          </w:p>
+        </w:tc>
+        <w:tc>
+          <w:tcPr>
+            <w:tcW w:type="dxa" w:w="5976"/>
+          </w:tcPr>
+          <w:p>
+            <w:r>
+              <w:t>Produto → complemento → quantidade → carrinho → pedido concluído com total de R$ 99,50.</w:t>
+            </w:r>
+          </w:p>
+        </w:tc>
+      </w:tr>
+      <w:tr>
+        <w:tc>
+          <w:tcPr>
+            <w:tcW w:type="dxa" w:w="2952"/>
+          </w:tcPr>
+          <w:p>
+            <w:r>
+              <w:t>Responsividade</w:t>
+            </w:r>
+          </w:p>
+        </w:tc>
+        <w:tc>
+          <w:tcPr>
+            <w:tcW w:type="dxa" w:w="5976"/>
+          </w:tcPr>
+          <w:p>
+            <w:r>
+              <w:t>Loja e detalhe validados em 1586 × 992 e 430 × 932.</w:t>
+            </w:r>
+          </w:p>
+        </w:tc>
+      </w:tr>
+    </w:tbl>
+    <w:p>
+      <w:r>
+        <w:br w:type="page"/>
+      </w:r>
+    </w:p>
+    <w:p>
+      <w:pPr>
+        <w:pStyle w:val="Heading1"/>
+      </w:pPr>
+      <w:r>
+        <w:t>16. Evidências visuais do produto</w:t>
+      </w:r>
+    </w:p>
+    <w:p>
+      <w:r>
+        <w:t>Loja publicada — composição desktop inspirada diretamente nas referências aprovadas.</w:t>
+      </w:r>
+    </w:p>
+    <w:p>
+      <w:r>
+        <w:drawing>
+          <wp:inline xmlns:a="http://schemas.openxmlformats.org/drawingml/2006/main" xmlns:pic="http://schemas.openxmlformats.org/drawingml/2006/picture">
+            <wp:extent cx="5897880" cy="3688964"/>
+            <wp:docPr id="5" name="Picture 5"/>
+            <wp:cNvGraphicFramePr>
+              <a:graphicFrameLocks noChangeAspect="1"/>
+            </wp:cNvGraphicFramePr>
+            <a:graphic>
+              <a:graphicData uri="http://schemas.openxmlformats.org/drawingml/2006/picture">
+                <pic:pic>
+                  <pic:nvPicPr>
+                    <pic:cNvPr id="0" name="seumei-store-desktop.png"/>
+                    <pic:cNvPicPr/>
+                  </pic:nvPicPr>
+                  <pic:blipFill>
+                    <a:blip r:embed="rId15"/>
+                    <a:stretch>
+                      <a:fillRect/>
+                    </a:stretch>
+                  </pic:blipFill>
+                  <pic:spPr>
+                    <a:xfrm>
+                      <a:off x="0" y="0"/>
+                      <a:ext cx="5897880" cy="3688964"/>
+                    </a:xfrm>
+                    <a:prstGeom prst="rect"/>
+                  </pic:spPr>
+                </pic:pic>
+              </a:graphicData>
+            </a:graphic>
+          </wp:inline>
+        </w:drawing>
+      </w:r>
+    </w:p>
+    <w:p>
+      <w:pPr>
+        <w:jc w:val="center"/>
+      </w:pPr>
+      <w:r>
+        <w:rPr>
+          <w:i/>
+          <w:sz w:val="18"/>
+        </w:rPr>
+        <w:t>Figura 6 — Loja pública Galáxia Burger, desktop.</w:t>
+      </w:r>
+    </w:p>
+    <w:p>
+      <w:r>
+        <w:br w:type="page"/>
+      </w:r>
+    </w:p>
+    <w:p>
+      <w:r>
+        <w:t>Loja publicada — navegação e catálogo mobile com controles de toque e barra inferior.</w:t>
+      </w:r>
+    </w:p>
+    <w:p>
+      <w:r>
+        <w:drawing>
+          <wp:inline xmlns:a="http://schemas.openxmlformats.org/drawingml/2006/main" xmlns:pic="http://schemas.openxmlformats.org/drawingml/2006/picture">
+            <wp:extent cx="3063240" cy="6639395"/>
+            <wp:docPr id="6" name="Picture 6"/>
+            <wp:cNvGraphicFramePr>
+              <a:graphicFrameLocks noChangeAspect="1"/>
+            </wp:cNvGraphicFramePr>
+            <a:graphic>
+              <a:graphicData uri="http://schemas.openxmlformats.org/drawingml/2006/picture">
+                <pic:pic>
+                  <pic:nvPicPr>
+                    <pic:cNvPr id="0" name="seumei-store-mobile.png"/>
+                    <pic:cNvPicPr/>
+                  </pic:nvPicPr>
+                  <pic:blipFill>
+                    <a:blip r:embed="rId16"/>
+                    <a:stretch>
+                      <a:fillRect/>
+                    </a:stretch>
+                  </pic:blipFill>
+                  <pic:spPr>
+                    <a:xfrm>
+                      <a:off x="0" y="0"/>
+                      <a:ext cx="3063240" cy="6639395"/>
+                    </a:xfrm>
+                    <a:prstGeom prst="rect"/>
+                  </pic:spPr>
+                </pic:pic>
+              </a:graphicData>
+            </a:graphic>
+          </wp:inline>
+        </w:drawing>
+      </w:r>
+    </w:p>
+    <w:p>
+      <w:pPr>
+        <w:jc w:val="center"/>
+      </w:pPr>
+      <w:r>
+        <w:rPr>
+          <w:i/>
+          <w:sz w:val="18"/>
+        </w:rPr>
+        <w:t>Figura 7 — Loja pública Galáxia Burger, mobile.</w:t>
+      </w:r>
+    </w:p>
+    <w:p>
+      <w:r>
+        <w:br w:type="page"/>
+      </w:r>
+    </w:p>
+    <w:p>
+      <w:r>
+        <w:t>Detalhe do produto — modificadores, quantidade, observação e total derivados do domínio.</w:t>
+      </w:r>
+    </w:p>
+    <w:p>
+      <w:r>
+        <w:drawing>
+          <wp:inline xmlns:a="http://schemas.openxmlformats.org/drawingml/2006/main" xmlns:pic="http://schemas.openxmlformats.org/drawingml/2006/picture">
+            <wp:extent cx="3063240" cy="11447969"/>
+            <wp:docPr id="7" name="Picture 7"/>
+            <wp:cNvGraphicFramePr>
+              <a:graphicFrameLocks noChangeAspect="1"/>
+            </wp:cNvGraphicFramePr>
+            <a:graphic>
+              <a:graphicData uri="http://schemas.openxmlformats.org/drawingml/2006/picture">
+                <pic:pic>
+                  <pic:nvPicPr>
+                    <pic:cNvPr id="0" name="seumei-product-detail-mobile.png"/>
+                    <pic:cNvPicPr/>
+                  </pic:nvPicPr>
+                  <pic:blipFill>
+                    <a:blip r:embed="rId17"/>
+                    <a:stretch>
+                      <a:fillRect/>
+                    </a:stretch>
+                  </pic:blipFill>
+                  <pic:spPr>
+                    <a:xfrm>
+                      <a:off x="0" y="0"/>
+                      <a:ext cx="3063240" cy="11447969"/>
+                    </a:xfrm>
+                    <a:prstGeom prst="rect"/>
+                  </pic:spPr>
+                </pic:pic>
+              </a:graphicData>
+            </a:graphic>
+          </wp:inline>
+        </w:drawing>
+      </w:r>
+    </w:p>
+    <w:p>
+      <w:pPr>
+        <w:jc w:val="center"/>
+      </w:pPr>
+      <w:r>
+        <w:rPr>
+          <w:i/>
+          <w:sz w:val="18"/>
+        </w:rPr>
+        <w:t>Figura 8 — X-Galáxia, detalhe mobile completo.</w:t>
+      </w:r>
+    </w:p>
+    <w:p>
+      <w:r>
+        <w:br w:type="page"/>
+      </w:r>
+    </w:p>
+    <w:p>
+      <w:r>
+        <w:t>Carrinho e checkout — fechamento do primeiro vertical slice de commerce.</w:t>
+      </w:r>
+    </w:p>
+    <w:p>
+      <w:r>
+        <w:drawing>
+          <wp:inline xmlns:a="http://schemas.openxmlformats.org/drawingml/2006/main" xmlns:pic="http://schemas.openxmlformats.org/drawingml/2006/picture">
+            <wp:extent cx="3063240" cy="6639395"/>
+            <wp:docPr id="8" name="Picture 8"/>
+            <wp:cNvGraphicFramePr>
+              <a:graphicFrameLocks noChangeAspect="1"/>
+            </wp:cNvGraphicFramePr>
+            <a:graphic>
+              <a:graphicData uri="http://schemas.openxmlformats.org/drawingml/2006/picture">
+                <pic:pic>
+                  <pic:nvPicPr>
+                    <pic:cNvPr id="0" name="seumei-cart-mobile.png"/>
+                    <pic:cNvPicPr/>
+                  </pic:nvPicPr>
+                  <pic:blipFill>
+                    <a:blip r:embed="rId18"/>
+                    <a:stretch>
+                      <a:fillRect/>
+                    </a:stretch>
+                  </pic:blipFill>
+                  <pic:spPr>
+                    <a:xfrm>
+                      <a:off x="0" y="0"/>
+                      <a:ext cx="3063240" cy="6639395"/>
+                    </a:xfrm>
+                    <a:prstGeom prst="rect"/>
+                  </pic:spPr>
+                </pic:pic>
+              </a:graphicData>
+            </a:graphic>
+          </wp:inline>
+        </w:drawing>
+      </w:r>
+    </w:p>
+    <w:p>
+      <w:pPr>
+        <w:jc w:val="center"/>
+      </w:pPr>
+      <w:r>
+        <w:rPr>
+          <w:i/>
+          <w:sz w:val="18"/>
+        </w:rPr>
+        <w:t>Figura 9 — Carrinho mobile com preço e checkout tenant-safe.</w:t>
+      </w:r>
+    </w:p>
+    <w:p>
+      <w:pPr>
+        <w:pStyle w:val="Heading1"/>
+      </w:pPr>
+      <w:r>
+        <w:t>17. Onde iremos a seguir</w:t>
+      </w:r>
+    </w:p>
+    <w:p>
+      <w:r>
+        <w:t>O próximo ciclo recomendado é Orders operacional → Dashboard → histórico do cliente no CRM. Ele fecha o circuito criado agora: um pedido público passa a aparecer na operação da empresa e na visão do cliente, sem mocks divergentes.</w:t>
+      </w:r>
+    </w:p>
+    <w:p>
+      <w:pPr>
+        <w:pStyle w:val="ListBullet"/>
+      </w:pPr>
+      <w:r>
+        <w:t>Criar lista e detalhe de Orders ligados ao repositório tenant-bound existente.</w:t>
+      </w:r>
+    </w:p>
+    <w:p>
+      <w:pPr>
+        <w:pStyle w:val="ListBullet"/>
+      </w:pPr>
+      <w:r>
+        <w:t>Derivar métricas do Dashboard a partir dos mesmos pedidos, produtos e clientes.</w:t>
+      </w:r>
+    </w:p>
+    <w:p>
+      <w:pPr>
+        <w:pStyle w:val="ListBullet"/>
+      </w:pPr>
+      <w:r>
+        <w:t>Expor compras recentes e histórico do cliente no CRM a partir de Order/OrderItem.</w:t>
+      </w:r>
+    </w:p>
+    <w:p>
+      <w:pPr>
+        <w:pStyle w:val="ListBullet"/>
+      </w:pPr>
+      <w:r>
+        <w:t>Adicionar ativação/configuração operacional da Store mantendo StoreAppearance separada de CompanyBranding e UserAppearancePreferences.</w:t>
+      </w:r>
+    </w:p>
+    <w:p>
+      <w:pPr>
+        <w:pStyle w:val="ListBullet"/>
+      </w:pPr>
+      <w:r>
+        <w:t>Consolidar ports Web/Tauri para notificações, secure storage e janela sem chamadas diretas em componentes React.</w:t>
+      </w:r>
+    </w:p>
+    <w:p>
+      <w:pPr>
+        <w:pStyle w:val="Heading1"/>
+      </w:pPr>
+      <w:r>
+        <w:t>18. Novo ponto de retomada</w:t>
+      </w:r>
+    </w:p>
+    <w:p>
+      <w:r>
+        <w:t>Main contém agora Hub multiempresa, shell compartilhado, Products Admin, catálogo persistido, Store pública, detalhe de produto, carrinho e criação de pedido. Retomar pelo app Orders, preservando os contratos e testes já introduzidos; não criar novos arrays de pedidos em páginas ou fixtures desconectadas.</w:t>
+      </w:r>
+    </w:p>
     <w:sectPr>
       <w:headerReference w:type="default" r:id="rId9"/>
       <w:footerReference w:type="default" r:id="rId10"/>

</xml_diff>